<commit_message>
Thêm dữ liệu vào bản báo cáo
</commit_message>
<xml_diff>
--- a/Báo Cáo Phần Mềm.docx
+++ b/Báo Cáo Phần Mềm.docx
@@ -5605,6 +5605,9 @@
         <w:ind w:left="720" w:firstLine="720"/>
       </w:pPr>
       <w:r>
+        <w:rPr>
+          <w:noProof/>
+        </w:rPr>
         <w:drawing>
           <wp:inline distT="0" distB="0" distL="0" distR="0" wp14:anchorId="4036E75C" wp14:editId="76A74BD7">
             <wp:extent cx="4213860" cy="1676357"/>
@@ -5645,11 +5648,1922 @@
     <w:p>
       <w:pPr>
         <w:spacing w:line="240" w:lineRule="auto"/>
-        <w:ind w:left="720" w:firstLine="720"/>
+      </w:pPr>
+      <w:r>
+        <w:lastRenderedPageBreak/>
+        <w:t>CHƯƠNG 4 : CÁC CHỨC NĂNG CHÍNH</w:t>
+      </w:r>
+    </w:p>
+    <w:p>
+      <w:pPr>
+        <w:spacing w:line="240" w:lineRule="auto"/>
+      </w:pPr>
+      <w:r>
+        <w:tab/>
+      </w:r>
+      <w:r>
+        <w:tab/>
+        <w:t>4.1 Các chức năng dàng cho khách hàng</w:t>
+      </w:r>
+    </w:p>
+    <w:p>
+      <w:pPr>
+        <w:spacing w:line="240" w:lineRule="auto"/>
+      </w:pPr>
+      <w:r>
+        <w:tab/>
+      </w:r>
+      <w:r>
+        <w:tab/>
+      </w:r>
+      <w:r>
+        <w:tab/>
+        <w:t>4.1.1 Duyệt và tìm kiếm sản phẩm</w:t>
+      </w:r>
+    </w:p>
+    <w:p>
+      <w:pPr>
+        <w:spacing w:line="240" w:lineRule="auto"/>
+      </w:pPr>
+      <w:r>
+        <w:tab/>
+      </w:r>
+      <w:r>
+        <w:tab/>
+      </w:r>
+      <w:r>
+        <w:tab/>
+      </w:r>
+      <w:r>
+        <w:tab/>
+        <w:t>Trang chủ hiển thị danh sách sản phẩm với ảnh, tên,giá và số lượng đã bãn.Sidebar động hiển thị danh mục và thương hiệu được lấy trực tiếp từ database – không hardcode.</w:t>
+      </w:r>
+    </w:p>
+    <w:p>
+      <w:pPr>
+        <w:pStyle w:val="ListParagraph"/>
+        <w:numPr>
+          <w:ilvl w:val="0"/>
+          <w:numId w:val="1"/>
+        </w:numPr>
+        <w:spacing w:line="240" w:lineRule="auto"/>
+      </w:pPr>
+      <w:r>
+        <w:t>Lọc theo danh mục: Nhấn tên Category trên sidebar -&gt; URL/products?category=…</w:t>
+      </w:r>
+    </w:p>
+    <w:p>
+      <w:pPr>
+        <w:pStyle w:val="ListParagraph"/>
+        <w:numPr>
+          <w:ilvl w:val="0"/>
+          <w:numId w:val="1"/>
+        </w:numPr>
+        <w:spacing w:line="240" w:lineRule="auto"/>
+      </w:pPr>
+      <w:r>
+        <w:t>Lọc theo thương hiệu: Nhấn Trademark -&gt; URL/products?trademark=…</w:t>
+      </w:r>
+    </w:p>
+    <w:p>
+      <w:pPr>
+        <w:pStyle w:val="ListParagraph"/>
+        <w:numPr>
+          <w:ilvl w:val="0"/>
+          <w:numId w:val="1"/>
+        </w:numPr>
+        <w:spacing w:line="240" w:lineRule="auto"/>
+      </w:pPr>
+      <w:r>
+        <w:t>Tìm kiếm từ khóa: LINQ Contains() tìm trong tên và mô tả sản phẩm</w:t>
+      </w:r>
+    </w:p>
+    <w:p>
+      <w:pPr>
+        <w:pStyle w:val="ListParagraph"/>
+        <w:numPr>
+          <w:ilvl w:val="0"/>
+          <w:numId w:val="1"/>
+        </w:numPr>
+        <w:spacing w:line="240" w:lineRule="auto"/>
+      </w:pPr>
+      <w:r>
+        <w:t>Sắp xếp: mới nhất/ bán chạy/ giá tăng/ giá giảm</w:t>
+      </w:r>
+    </w:p>
+    <w:p>
+      <w:pPr>
+        <w:pStyle w:val="ListParagraph"/>
+        <w:numPr>
+          <w:ilvl w:val="0"/>
+          <w:numId w:val="1"/>
+        </w:numPr>
+        <w:spacing w:line="240" w:lineRule="auto"/>
+      </w:pPr>
+      <w:r>
+        <w:t>Phân trang: Skip/Take, 12 sản phẩm mỗi trang , URL giữ nguyên filter</w:t>
+      </w:r>
+    </w:p>
+    <w:p>
+      <w:pPr>
+        <w:spacing w:line="240" w:lineRule="auto"/>
+        <w:ind w:left="1440" w:firstLine="720"/>
+      </w:pPr>
+      <w:r>
+        <w:drawing>
+          <wp:inline distT="0" distB="0" distL="0" distR="0" wp14:anchorId="1598F73F" wp14:editId="0C2B5D76">
+            <wp:extent cx="5097911" cy="1660277"/>
+            <wp:effectExtent l="0" t="0" r="7620" b="0"/>
+            <wp:docPr id="1938142682" name="Picture 1" descr="A screen shot of a computer program&#10;&#10;AI-generated content may be incorrect."/>
+            <wp:cNvGraphicFramePr>
+              <a:graphicFrameLocks xmlns:a="http://schemas.openxmlformats.org/drawingml/2006/main" noChangeAspect="1"/>
+            </wp:cNvGraphicFramePr>
+            <a:graphic xmlns:a="http://schemas.openxmlformats.org/drawingml/2006/main">
+              <a:graphicData uri="http://schemas.openxmlformats.org/drawingml/2006/picture">
+                <pic:pic xmlns:pic="http://schemas.openxmlformats.org/drawingml/2006/picture">
+                  <pic:nvPicPr>
+                    <pic:cNvPr id="1938142682" name="Picture 1" descr="A screen shot of a computer program&#10;&#10;AI-generated content may be incorrect."/>
+                    <pic:cNvPicPr/>
+                  </pic:nvPicPr>
+                  <pic:blipFill>
+                    <a:blip r:embed="rId27"/>
+                    <a:stretch>
+                      <a:fillRect/>
+                    </a:stretch>
+                  </pic:blipFill>
+                  <pic:spPr>
+                    <a:xfrm>
+                      <a:off x="0" y="0"/>
+                      <a:ext cx="5151894" cy="1677858"/>
+                    </a:xfrm>
+                    <a:prstGeom prst="rect">
+                      <a:avLst/>
+                    </a:prstGeom>
+                  </pic:spPr>
+                </pic:pic>
+              </a:graphicData>
+            </a:graphic>
+          </wp:inline>
+        </w:drawing>
+      </w:r>
+    </w:p>
+    <w:p>
+      <w:pPr>
+        <w:spacing w:line="240" w:lineRule="auto"/>
+        <w:ind w:firstLine="720"/>
+      </w:pPr>
+    </w:p>
+    <w:p>
+      <w:pPr>
+        <w:spacing w:line="240" w:lineRule="auto"/>
+        <w:ind w:firstLine="720"/>
+      </w:pPr>
+      <w:r>
+        <w:tab/>
+      </w:r>
+      <w:r>
+        <w:tab/>
+        <w:t>4.1.2 Giỏ Hàng (Shopping Cart)</w:t>
+      </w:r>
+    </w:p>
+    <w:p>
+      <w:pPr>
+        <w:spacing w:line="240" w:lineRule="auto"/>
+        <w:ind w:firstLine="720"/>
+      </w:pPr>
+      <w:r>
+        <w:tab/>
+      </w:r>
+      <w:r>
+        <w:tab/>
+      </w:r>
+      <w:r>
+        <w:tab/>
+        <w:t>Giỏ hàng hoạt động theo cơ chế AJAX – thêm/xóa/cập nhật số lượng không cần reload trang. Dữ liệu được lưu vào bảng cartitem trong database, gắn với user đã đăng nhập.</w:t>
+      </w:r>
+    </w:p>
+    <w:p>
+      <w:pPr>
+        <w:pStyle w:val="ListParagraph"/>
+        <w:numPr>
+          <w:ilvl w:val="0"/>
+          <w:numId w:val="1"/>
+        </w:numPr>
+        <w:spacing w:line="240" w:lineRule="auto"/>
+      </w:pPr>
+      <w:r>
+        <w:t>Thêm vào giỏ: Gọi POST/Cart/Add qua Fetch API, trả JSON cập nhật badge số lượng</w:t>
+      </w:r>
+    </w:p>
+    <w:p>
+      <w:pPr>
+        <w:pStyle w:val="ListParagraph"/>
+        <w:numPr>
+          <w:ilvl w:val="0"/>
+          <w:numId w:val="1"/>
+        </w:numPr>
+        <w:spacing w:line="240" w:lineRule="auto"/>
+      </w:pPr>
+      <w:r>
+        <w:t>Xem giỏ hàng: Liệt kê tất cả CartItem, hiển thị ảnh sản phẩm , giá, tổng tiền</w:t>
+      </w:r>
+    </w:p>
+    <w:p>
+      <w:pPr>
+        <w:pStyle w:val="ListParagraph"/>
+        <w:numPr>
+          <w:ilvl w:val="0"/>
+          <w:numId w:val="1"/>
+        </w:numPr>
+        <w:spacing w:line="240" w:lineRule="auto"/>
+      </w:pPr>
+      <w:r>
+        <w:t>Cập nhật số lượng: tăng/giảm inline, tự động tính lại tổng</w:t>
+      </w:r>
+    </w:p>
+    <w:p>
+      <w:pPr>
+        <w:pStyle w:val="ListParagraph"/>
+        <w:numPr>
+          <w:ilvl w:val="0"/>
+          <w:numId w:val="1"/>
+        </w:numPr>
+        <w:spacing w:line="240" w:lineRule="auto"/>
+      </w:pPr>
+      <w:r>
+        <w:t>Xóa sản phẩm: Xóa CartItem khỏi Database , cập nhật UI không reload</w:t>
+      </w:r>
+    </w:p>
+    <w:p>
+      <w:pPr>
+        <w:pStyle w:val="ListParagraph"/>
+        <w:numPr>
+          <w:ilvl w:val="0"/>
+          <w:numId w:val="1"/>
+        </w:numPr>
+        <w:spacing w:line="240" w:lineRule="auto"/>
+      </w:pPr>
+      <w:r>
+        <w:t>AntiForgery Token : Bảo vệ mọi POST request khỏi CSRF attack</w:t>
+      </w:r>
+    </w:p>
+    <w:p>
+      <w:pPr>
+        <w:spacing w:line="240" w:lineRule="auto"/>
+        <w:ind w:left="1440" w:firstLine="720"/>
+      </w:pPr>
+      <w:r>
+        <w:drawing>
+          <wp:inline distT="0" distB="0" distL="0" distR="0" wp14:anchorId="6C0604B0" wp14:editId="0C05B502">
+            <wp:extent cx="4701947" cy="2385267"/>
+            <wp:effectExtent l="0" t="0" r="3810" b="0"/>
+            <wp:docPr id="142558245" name="Picture 1" descr="A computer screen with text&#10;&#10;AI-generated content may be incorrect."/>
+            <wp:cNvGraphicFramePr>
+              <a:graphicFrameLocks xmlns:a="http://schemas.openxmlformats.org/drawingml/2006/main" noChangeAspect="1"/>
+            </wp:cNvGraphicFramePr>
+            <a:graphic xmlns:a="http://schemas.openxmlformats.org/drawingml/2006/main">
+              <a:graphicData uri="http://schemas.openxmlformats.org/drawingml/2006/picture">
+                <pic:pic xmlns:pic="http://schemas.openxmlformats.org/drawingml/2006/picture">
+                  <pic:nvPicPr>
+                    <pic:cNvPr id="142558245" name="Picture 1" descr="A computer screen with text&#10;&#10;AI-generated content may be incorrect."/>
+                    <pic:cNvPicPr/>
+                  </pic:nvPicPr>
+                  <pic:blipFill>
+                    <a:blip r:embed="rId28"/>
+                    <a:stretch>
+                      <a:fillRect/>
+                    </a:stretch>
+                  </pic:blipFill>
+                  <pic:spPr>
+                    <a:xfrm>
+                      <a:off x="0" y="0"/>
+                      <a:ext cx="4701947" cy="2385267"/>
+                    </a:xfrm>
+                    <a:prstGeom prst="rect">
+                      <a:avLst/>
+                    </a:prstGeom>
+                  </pic:spPr>
+                </pic:pic>
+              </a:graphicData>
+            </a:graphic>
+          </wp:inline>
+        </w:drawing>
+      </w:r>
+    </w:p>
+    <w:p>
+      <w:pPr>
+        <w:spacing w:line="240" w:lineRule="auto"/>
+        <w:ind w:left="720"/>
+      </w:pPr>
+      <w:r>
+        <w:tab/>
+      </w:r>
+      <w:r>
+        <w:tab/>
+        <w:t>4.1.3 Checkout và Đặt hàng</w:t>
+      </w:r>
+    </w:p>
+    <w:p>
+      <w:pPr>
+        <w:spacing w:line="240" w:lineRule="auto"/>
+        <w:ind w:left="720"/>
+      </w:pPr>
+      <w:r>
+        <w:lastRenderedPageBreak/>
+        <w:tab/>
+      </w:r>
+      <w:r>
+        <w:tab/>
+      </w:r>
+      <w:r>
+        <w:tab/>
+        <w:t>Quy trình checkout gồm 3 bược: xem lại giỏ hàng -&gt; điền thông tin giao hàng -&gt; xác nhận và đặt hàng. Sau khi hoàn tất , hệ thống tạo Order và OrderDetail , cộng sold count cho từng sản phẩm</w:t>
+      </w:r>
+    </w:p>
+    <w:p>
+      <w:pPr>
+        <w:pStyle w:val="ListParagraph"/>
+        <w:numPr>
+          <w:ilvl w:val="0"/>
+          <w:numId w:val="1"/>
+        </w:numPr>
+        <w:spacing w:line="240" w:lineRule="auto"/>
+      </w:pPr>
+      <w:r>
+        <w:t>Khách hàng thanh toán -&gt; hiển thị trang Checkout.cshtml</w:t>
+      </w:r>
+    </w:p>
+    <w:p>
+      <w:pPr>
+        <w:pStyle w:val="ListParagraph"/>
+        <w:numPr>
+          <w:ilvl w:val="0"/>
+          <w:numId w:val="1"/>
+        </w:numPr>
+        <w:spacing w:line="240" w:lineRule="auto"/>
+      </w:pPr>
+    </w:p>
+    <w:p>
+      <w:pPr>
+        <w:pStyle w:val="ListParagraph"/>
+        <w:spacing w:line="240" w:lineRule="auto"/>
+        <w:ind w:left="2520"/>
+      </w:pPr>
+      <w:r>
+        <w:drawing>
+          <wp:inline distT="0" distB="0" distL="0" distR="0" wp14:anchorId="1DBD3710" wp14:editId="1710EE19">
+            <wp:extent cx="3254469" cy="2438862"/>
+            <wp:effectExtent l="0" t="0" r="3175" b="0"/>
+            <wp:docPr id="252105778" name="Picture 1" descr="A screenshot of a computer&#10;&#10;AI-generated content may be incorrect."/>
+            <wp:cNvGraphicFramePr>
+              <a:graphicFrameLocks xmlns:a="http://schemas.openxmlformats.org/drawingml/2006/main" noChangeAspect="1"/>
+            </wp:cNvGraphicFramePr>
+            <a:graphic xmlns:a="http://schemas.openxmlformats.org/drawingml/2006/main">
+              <a:graphicData uri="http://schemas.openxmlformats.org/drawingml/2006/picture">
+                <pic:pic xmlns:pic="http://schemas.openxmlformats.org/drawingml/2006/picture">
+                  <pic:nvPicPr>
+                    <pic:cNvPr id="252105778" name="Picture 1" descr="A screenshot of a computer&#10;&#10;AI-generated content may be incorrect."/>
+                    <pic:cNvPicPr/>
+                  </pic:nvPicPr>
+                  <pic:blipFill>
+                    <a:blip r:embed="rId29"/>
+                    <a:stretch>
+                      <a:fillRect/>
+                    </a:stretch>
+                  </pic:blipFill>
+                  <pic:spPr>
+                    <a:xfrm>
+                      <a:off x="0" y="0"/>
+                      <a:ext cx="3273054" cy="2452790"/>
+                    </a:xfrm>
+                    <a:prstGeom prst="rect">
+                      <a:avLst/>
+                    </a:prstGeom>
+                  </pic:spPr>
+                </pic:pic>
+              </a:graphicData>
+            </a:graphic>
+          </wp:inline>
+        </w:drawing>
+      </w:r>
+    </w:p>
+    <w:p>
+      <w:pPr>
+        <w:pStyle w:val="ListParagraph"/>
+        <w:spacing w:line="240" w:lineRule="auto"/>
+        <w:ind w:left="2520"/>
+      </w:pPr>
+    </w:p>
+    <w:p>
+      <w:pPr>
+        <w:pStyle w:val="ListParagraph"/>
+        <w:numPr>
+          <w:ilvl w:val="0"/>
+          <w:numId w:val="1"/>
+        </w:numPr>
+        <w:spacing w:line="240" w:lineRule="auto"/>
+      </w:pPr>
+      <w:r>
+        <w:t>Điền thông tin: địa chỉ giao hàng,  số điện thoại</w:t>
+      </w:r>
+    </w:p>
+    <w:p>
+      <w:pPr>
+        <w:pStyle w:val="ListParagraph"/>
+        <w:numPr>
+          <w:ilvl w:val="0"/>
+          <w:numId w:val="1"/>
+        </w:numPr>
+        <w:spacing w:line="240" w:lineRule="auto"/>
+      </w:pPr>
+      <w:r>
+        <w:t>Xác nhận đặt hàng -&gt; POST/Order/Checkout</w:t>
+      </w:r>
+    </w:p>
+    <w:p>
+      <w:pPr>
+        <w:pStyle w:val="ListParagraph"/>
+        <w:numPr>
+          <w:ilvl w:val="0"/>
+          <w:numId w:val="1"/>
+        </w:numPr>
+        <w:spacing w:line="240" w:lineRule="auto"/>
+      </w:pPr>
+      <w:r>
+        <w:t>OrderRepository</w:t>
+      </w:r>
+      <w:r>
+        <w:t>.CreateOrderAsync() tạo order</w:t>
+      </w:r>
+    </w:p>
+    <w:p>
+      <w:pPr>
+        <w:pStyle w:val="ListParagraph"/>
+        <w:numPr>
+          <w:ilvl w:val="0"/>
+          <w:numId w:val="1"/>
+        </w:numPr>
+        <w:spacing w:line="240" w:lineRule="auto"/>
+      </w:pPr>
+    </w:p>
+    <w:p>
+      <w:pPr>
+        <w:pStyle w:val="ListParagraph"/>
+        <w:spacing w:line="240" w:lineRule="auto"/>
+        <w:ind w:left="2520"/>
+      </w:pPr>
+      <w:r>
+        <w:drawing>
+          <wp:inline distT="0" distB="0" distL="0" distR="0" wp14:anchorId="6B79E18E" wp14:editId="45D2DAED">
+            <wp:extent cx="2911092" cy="815411"/>
+            <wp:effectExtent l="0" t="0" r="3810" b="3810"/>
+            <wp:docPr id="1773066094" name="Picture 1" descr="A screenshot of a computer program&#10;&#10;AI-generated content may be incorrect."/>
+            <wp:cNvGraphicFramePr>
+              <a:graphicFrameLocks xmlns:a="http://schemas.openxmlformats.org/drawingml/2006/main" noChangeAspect="1"/>
+            </wp:cNvGraphicFramePr>
+            <a:graphic xmlns:a="http://schemas.openxmlformats.org/drawingml/2006/main">
+              <a:graphicData uri="http://schemas.openxmlformats.org/drawingml/2006/picture">
+                <pic:pic xmlns:pic="http://schemas.openxmlformats.org/drawingml/2006/picture">
+                  <pic:nvPicPr>
+                    <pic:cNvPr id="1773066094" name="Picture 1" descr="A screenshot of a computer program&#10;&#10;AI-generated content may be incorrect."/>
+                    <pic:cNvPicPr/>
+                  </pic:nvPicPr>
+                  <pic:blipFill>
+                    <a:blip r:embed="rId30"/>
+                    <a:stretch>
+                      <a:fillRect/>
+                    </a:stretch>
+                  </pic:blipFill>
+                  <pic:spPr>
+                    <a:xfrm>
+                      <a:off x="0" y="0"/>
+                      <a:ext cx="2911092" cy="815411"/>
+                    </a:xfrm>
+                    <a:prstGeom prst="rect">
+                      <a:avLst/>
+                    </a:prstGeom>
+                  </pic:spPr>
+                </pic:pic>
+              </a:graphicData>
+            </a:graphic>
+          </wp:inline>
+        </w:drawing>
+      </w:r>
+    </w:p>
+    <w:p>
+      <w:pPr>
+        <w:pStyle w:val="ListParagraph"/>
+        <w:spacing w:line="240" w:lineRule="auto"/>
+        <w:ind w:left="2520"/>
+      </w:pPr>
+    </w:p>
+    <w:p>
+      <w:pPr>
+        <w:pStyle w:val="ListParagraph"/>
+        <w:numPr>
+          <w:ilvl w:val="0"/>
+          <w:numId w:val="1"/>
+        </w:numPr>
+        <w:spacing w:line="240" w:lineRule="auto"/>
+      </w:pPr>
+      <w:r>
+        <w:t>Redirect sang Success.cshtml kèm mã đơn hàng</w:t>
+      </w:r>
+    </w:p>
+    <w:p>
+      <w:pPr>
+        <w:pStyle w:val="ListParagraph"/>
+        <w:spacing w:line="240" w:lineRule="auto"/>
+        <w:ind w:left="2520"/>
+      </w:pPr>
+    </w:p>
+    <w:p>
+      <w:pPr>
+        <w:pStyle w:val="ListParagraph"/>
+        <w:spacing w:line="240" w:lineRule="auto"/>
+        <w:ind w:left="2520"/>
+      </w:pPr>
+      <w:r>
+        <w:drawing>
+          <wp:inline distT="0" distB="0" distL="0" distR="0" wp14:anchorId="0195CC84" wp14:editId="0649D488">
+            <wp:extent cx="3362821" cy="2389909"/>
+            <wp:effectExtent l="0" t="0" r="0" b="0"/>
+            <wp:docPr id="136261221" name="Picture 1" descr="A screenshot of a computer&#10;&#10;AI-generated content may be incorrect."/>
+            <wp:cNvGraphicFramePr>
+              <a:graphicFrameLocks xmlns:a="http://schemas.openxmlformats.org/drawingml/2006/main" noChangeAspect="1"/>
+            </wp:cNvGraphicFramePr>
+            <a:graphic xmlns:a="http://schemas.openxmlformats.org/drawingml/2006/main">
+              <a:graphicData uri="http://schemas.openxmlformats.org/drawingml/2006/picture">
+                <pic:pic xmlns:pic="http://schemas.openxmlformats.org/drawingml/2006/picture">
+                  <pic:nvPicPr>
+                    <pic:cNvPr id="136261221" name="Picture 1" descr="A screenshot of a computer&#10;&#10;AI-generated content may be incorrect."/>
+                    <pic:cNvPicPr/>
+                  </pic:nvPicPr>
+                  <pic:blipFill>
+                    <a:blip r:embed="rId31"/>
+                    <a:stretch>
+                      <a:fillRect/>
+                    </a:stretch>
+                  </pic:blipFill>
+                  <pic:spPr>
+                    <a:xfrm>
+                      <a:off x="0" y="0"/>
+                      <a:ext cx="3386077" cy="2406437"/>
+                    </a:xfrm>
+                    <a:prstGeom prst="rect">
+                      <a:avLst/>
+                    </a:prstGeom>
+                  </pic:spPr>
+                </pic:pic>
+              </a:graphicData>
+            </a:graphic>
+          </wp:inline>
+        </w:drawing>
+      </w:r>
+    </w:p>
+    <w:p>
+      <w:pPr>
+        <w:spacing w:line="240" w:lineRule="auto"/>
+      </w:pPr>
+    </w:p>
+    <w:p>
+      <w:pPr>
+        <w:spacing w:line="240" w:lineRule="auto"/>
+      </w:pPr>
+      <w:r>
+        <w:tab/>
+      </w:r>
+      <w:r>
+        <w:tab/>
+      </w:r>
+      <w:r>
+        <w:tab/>
+        <w:t>4.1.4 Xác thực người dùng</w:t>
+      </w:r>
+    </w:p>
+    <w:p>
+      <w:pPr>
+        <w:spacing w:line="240" w:lineRule="auto"/>
+      </w:pPr>
+      <w:r>
+        <w:lastRenderedPageBreak/>
+        <w:tab/>
+      </w:r>
+      <w:r>
+        <w:tab/>
+      </w:r>
+      <w:r>
+        <w:tab/>
+      </w:r>
+      <w:r>
+        <w:tab/>
+        <w:t>Hệ thống sử dụng Cookie Authentication với Claims. Sau khi đăng nhập thành công , server tạo cookie chưa thông tin người dùng. Mọi Request tiếp theo gửi kèm Cookie – không cần truy vấn lại database để xác thực</w:t>
+      </w:r>
+    </w:p>
+    <w:p>
+      <w:pPr>
+        <w:pStyle w:val="ListParagraph"/>
+        <w:numPr>
+          <w:ilvl w:val="0"/>
+          <w:numId w:val="1"/>
+        </w:numPr>
+        <w:spacing w:line="240" w:lineRule="auto"/>
+      </w:pPr>
+      <w:r>
+        <w:t>Đăng ký : nhập email, mật khẩu , tên – Hash password trước khi lưu ĐB</w:t>
+      </w:r>
+    </w:p>
+    <w:p>
+      <w:pPr>
+        <w:pStyle w:val="ListParagraph"/>
+        <w:spacing w:line="240" w:lineRule="auto"/>
+        <w:ind w:left="2520"/>
+      </w:pPr>
+    </w:p>
+    <w:p>
+      <w:pPr>
+        <w:pStyle w:val="ListParagraph"/>
+        <w:spacing w:line="240" w:lineRule="auto"/>
+        <w:ind w:left="2520"/>
+      </w:pPr>
+      <w:r>
+        <w:drawing>
+          <wp:inline distT="0" distB="0" distL="0" distR="0" wp14:anchorId="2CE82C24" wp14:editId="2F710B1C">
+            <wp:extent cx="4000500" cy="2267953"/>
+            <wp:effectExtent l="0" t="0" r="0" b="0"/>
+            <wp:docPr id="1594826680" name="Picture 1" descr="A computer screen shot of a program&#10;&#10;AI-generated content may be incorrect."/>
+            <wp:cNvGraphicFramePr>
+              <a:graphicFrameLocks xmlns:a="http://schemas.openxmlformats.org/drawingml/2006/main" noChangeAspect="1"/>
+            </wp:cNvGraphicFramePr>
+            <a:graphic xmlns:a="http://schemas.openxmlformats.org/drawingml/2006/main">
+              <a:graphicData uri="http://schemas.openxmlformats.org/drawingml/2006/picture">
+                <pic:pic xmlns:pic="http://schemas.openxmlformats.org/drawingml/2006/picture">
+                  <pic:nvPicPr>
+                    <pic:cNvPr id="1594826680" name="Picture 1" descr="A computer screen shot of a program&#10;&#10;AI-generated content may be incorrect."/>
+                    <pic:cNvPicPr/>
+                  </pic:nvPicPr>
+                  <pic:blipFill>
+                    <a:blip r:embed="rId32"/>
+                    <a:stretch>
+                      <a:fillRect/>
+                    </a:stretch>
+                  </pic:blipFill>
+                  <pic:spPr>
+                    <a:xfrm>
+                      <a:off x="0" y="0"/>
+                      <a:ext cx="4014180" cy="2275708"/>
+                    </a:xfrm>
+                    <a:prstGeom prst="rect">
+                      <a:avLst/>
+                    </a:prstGeom>
+                  </pic:spPr>
+                </pic:pic>
+              </a:graphicData>
+            </a:graphic>
+          </wp:inline>
+        </w:drawing>
+      </w:r>
+    </w:p>
+    <w:p>
+      <w:pPr>
+        <w:spacing w:line="240" w:lineRule="auto"/>
+      </w:pPr>
+    </w:p>
+    <w:p>
+      <w:pPr>
+        <w:pStyle w:val="ListParagraph"/>
+        <w:numPr>
+          <w:ilvl w:val="0"/>
+          <w:numId w:val="1"/>
+        </w:numPr>
+        <w:spacing w:line="240" w:lineRule="auto"/>
+      </w:pPr>
+      <w:r>
+        <w:t>Đăng nhập : Kiểm tra email + password hash -&gt; tạo ClaimsPrincipal -&gt; LoginAsync()</w:t>
+      </w:r>
+    </w:p>
+    <w:p>
+      <w:pPr>
+        <w:pStyle w:val="ListParagraph"/>
+        <w:spacing w:line="240" w:lineRule="auto"/>
+        <w:ind w:left="2520"/>
+      </w:pPr>
+    </w:p>
+    <w:p>
+      <w:pPr>
+        <w:pStyle w:val="ListParagraph"/>
+        <w:spacing w:line="240" w:lineRule="auto"/>
+        <w:ind w:left="2520"/>
+      </w:pPr>
+      <w:r>
+        <w:drawing>
+          <wp:inline distT="0" distB="0" distL="0" distR="0" wp14:anchorId="1687F4F0" wp14:editId="4BC175DB">
+            <wp:extent cx="3991495" cy="1469261"/>
+            <wp:effectExtent l="0" t="0" r="0" b="0"/>
+            <wp:docPr id="995707892" name="Picture 1" descr="A computer screen with text on it&#10;&#10;AI-generated content may be incorrect."/>
+            <wp:cNvGraphicFramePr>
+              <a:graphicFrameLocks xmlns:a="http://schemas.openxmlformats.org/drawingml/2006/main" noChangeAspect="1"/>
+            </wp:cNvGraphicFramePr>
+            <a:graphic xmlns:a="http://schemas.openxmlformats.org/drawingml/2006/main">
+              <a:graphicData uri="http://schemas.openxmlformats.org/drawingml/2006/picture">
+                <pic:pic xmlns:pic="http://schemas.openxmlformats.org/drawingml/2006/picture">
+                  <pic:nvPicPr>
+                    <pic:cNvPr id="995707892" name="Picture 1" descr="A computer screen with text on it&#10;&#10;AI-generated content may be incorrect."/>
+                    <pic:cNvPicPr/>
+                  </pic:nvPicPr>
+                  <pic:blipFill>
+                    <a:blip r:embed="rId33"/>
+                    <a:stretch>
+                      <a:fillRect/>
+                    </a:stretch>
+                  </pic:blipFill>
+                  <pic:spPr>
+                    <a:xfrm>
+                      <a:off x="0" y="0"/>
+                      <a:ext cx="4016619" cy="1478509"/>
+                    </a:xfrm>
+                    <a:prstGeom prst="rect">
+                      <a:avLst/>
+                    </a:prstGeom>
+                  </pic:spPr>
+                </pic:pic>
+              </a:graphicData>
+            </a:graphic>
+          </wp:inline>
+        </w:drawing>
+      </w:r>
+    </w:p>
+    <w:p>
+      <w:pPr>
+        <w:pStyle w:val="ListParagraph"/>
+        <w:spacing w:line="240" w:lineRule="auto"/>
+        <w:ind w:left="2520"/>
+      </w:pPr>
+    </w:p>
+    <w:p>
+      <w:pPr>
+        <w:pStyle w:val="ListParagraph"/>
+        <w:numPr>
+          <w:ilvl w:val="0"/>
+          <w:numId w:val="1"/>
+        </w:numPr>
+        <w:spacing w:line="240" w:lineRule="auto"/>
+      </w:pPr>
+      <w:r>
+        <w:t xml:space="preserve">Đăng xuất : </w:t>
+      </w:r>
+      <w:r>
+        <w:t>EmailExitAsync() xóa cookie</w:t>
+      </w:r>
+    </w:p>
+    <w:p>
+      <w:pPr>
+        <w:pStyle w:val="ListParagraph"/>
+        <w:spacing w:line="240" w:lineRule="auto"/>
+        <w:ind w:left="2520"/>
+      </w:pPr>
+    </w:p>
+    <w:p>
+      <w:pPr>
+        <w:pStyle w:val="ListParagraph"/>
+        <w:spacing w:line="240" w:lineRule="auto"/>
+        <w:ind w:left="2520"/>
+      </w:pPr>
+      <w:r>
+        <w:drawing>
+          <wp:inline distT="0" distB="0" distL="0" distR="0" wp14:anchorId="7CED8477" wp14:editId="3EFFB6A0">
+            <wp:extent cx="3368332" cy="624894"/>
+            <wp:effectExtent l="0" t="0" r="3810" b="3810"/>
+            <wp:docPr id="1268877783" name="Picture 1"/>
+            <wp:cNvGraphicFramePr>
+              <a:graphicFrameLocks xmlns:a="http://schemas.openxmlformats.org/drawingml/2006/main" noChangeAspect="1"/>
+            </wp:cNvGraphicFramePr>
+            <a:graphic xmlns:a="http://schemas.openxmlformats.org/drawingml/2006/main">
+              <a:graphicData uri="http://schemas.openxmlformats.org/drawingml/2006/picture">
+                <pic:pic xmlns:pic="http://schemas.openxmlformats.org/drawingml/2006/picture">
+                  <pic:nvPicPr>
+                    <pic:cNvPr id="1268877783" name=""/>
+                    <pic:cNvPicPr/>
+                  </pic:nvPicPr>
+                  <pic:blipFill>
+                    <a:blip r:embed="rId34"/>
+                    <a:stretch>
+                      <a:fillRect/>
+                    </a:stretch>
+                  </pic:blipFill>
+                  <pic:spPr>
+                    <a:xfrm>
+                      <a:off x="0" y="0"/>
+                      <a:ext cx="3368332" cy="624894"/>
+                    </a:xfrm>
+                    <a:prstGeom prst="rect">
+                      <a:avLst/>
+                    </a:prstGeom>
+                  </pic:spPr>
+                </pic:pic>
+              </a:graphicData>
+            </a:graphic>
+          </wp:inline>
+        </w:drawing>
+      </w:r>
+    </w:p>
+    <w:p>
+      <w:pPr>
+        <w:pStyle w:val="ListParagraph"/>
+        <w:spacing w:line="240" w:lineRule="auto"/>
+        <w:ind w:left="2520"/>
+      </w:pPr>
+    </w:p>
+    <w:p>
+      <w:pPr>
+        <w:pStyle w:val="ListParagraph"/>
+        <w:numPr>
+          <w:ilvl w:val="0"/>
+          <w:numId w:val="1"/>
+        </w:numPr>
+        <w:spacing w:line="240" w:lineRule="auto"/>
+      </w:pPr>
+      <w:r>
+        <w:t>[Authorize]: chặn trang yêu cầu đăng nhập, redirect về /Account/Login</w:t>
+      </w:r>
+    </w:p>
+    <w:p>
+      <w:pPr>
+        <w:pStyle w:val="ListParagraph"/>
+        <w:spacing w:line="240" w:lineRule="auto"/>
+        <w:ind w:left="2520"/>
+      </w:pPr>
+    </w:p>
+    <w:p>
+      <w:pPr>
+        <w:pStyle w:val="ListParagraph"/>
+        <w:spacing w:line="240" w:lineRule="auto"/>
+        <w:ind w:left="2520"/>
+      </w:pPr>
+      <w:r>
+        <w:drawing>
+          <wp:inline distT="0" distB="0" distL="0" distR="0" wp14:anchorId="557EEC8D" wp14:editId="34765ED3">
+            <wp:extent cx="3368040" cy="1082770"/>
+            <wp:effectExtent l="0" t="0" r="3810" b="3175"/>
+            <wp:docPr id="667969429" name="Picture 1" descr="A computer screen shot of code&#10;&#10;AI-generated content may be incorrect."/>
+            <wp:cNvGraphicFramePr>
+              <a:graphicFrameLocks xmlns:a="http://schemas.openxmlformats.org/drawingml/2006/main" noChangeAspect="1"/>
+            </wp:cNvGraphicFramePr>
+            <a:graphic xmlns:a="http://schemas.openxmlformats.org/drawingml/2006/main">
+              <a:graphicData uri="http://schemas.openxmlformats.org/drawingml/2006/picture">
+                <pic:pic xmlns:pic="http://schemas.openxmlformats.org/drawingml/2006/picture">
+                  <pic:nvPicPr>
+                    <pic:cNvPr id="667969429" name="Picture 1" descr="A computer screen shot of code&#10;&#10;AI-generated content may be incorrect."/>
+                    <pic:cNvPicPr/>
+                  </pic:nvPicPr>
+                  <pic:blipFill>
+                    <a:blip r:embed="rId35"/>
+                    <a:stretch>
+                      <a:fillRect/>
+                    </a:stretch>
+                  </pic:blipFill>
+                  <pic:spPr>
+                    <a:xfrm>
+                      <a:off x="0" y="0"/>
+                      <a:ext cx="3387890" cy="1089152"/>
+                    </a:xfrm>
+                    <a:prstGeom prst="rect">
+                      <a:avLst/>
+                    </a:prstGeom>
+                  </pic:spPr>
+                </pic:pic>
+              </a:graphicData>
+            </a:graphic>
+          </wp:inline>
+        </w:drawing>
+      </w:r>
+    </w:p>
+    <w:p>
+      <w:pPr>
+        <w:spacing w:line="240" w:lineRule="auto"/>
+      </w:pPr>
+      <w:r>
+        <w:tab/>
+      </w:r>
+      <w:r>
+        <w:tab/>
+      </w:r>
+    </w:p>
+    <w:p>
+      <w:pPr>
+        <w:spacing w:line="240" w:lineRule="auto"/>
+      </w:pPr>
+      <w:r>
+        <w:lastRenderedPageBreak/>
+        <w:tab/>
+      </w:r>
+      <w:r>
+        <w:tab/>
+        <w:t>4.2 Chức năng quản trị (Admin panel)</w:t>
+      </w:r>
+    </w:p>
+    <w:p>
+      <w:pPr>
+        <w:spacing w:line="240" w:lineRule="auto"/>
+      </w:pPr>
+      <w:r>
+        <w:tab/>
+      </w:r>
+      <w:r>
+        <w:tab/>
+      </w:r>
+      <w:r>
+        <w:tab/>
+        <w:t>4.2.1 Quản lý sản phẩm</w:t>
+      </w:r>
+    </w:p>
+    <w:p>
+      <w:pPr>
+        <w:spacing w:line="240" w:lineRule="auto"/>
+      </w:pPr>
+      <w:r>
+        <w:tab/>
+      </w:r>
+      <w:r>
+        <w:tab/>
+      </w:r>
+      <w:r>
+        <w:tab/>
+      </w:r>
+      <w:r>
+        <w:tab/>
+        <w:t>Admin có toàn quyền CRUD sản phẩm. Mỗi sản có ảnh upload vào wwwroot/images/products/ , liên kết với danh mục. Khỏi tạo mới sản phẩm , category.Total tự động tăng. Khi xóa , hệ thống cascade delete CartItem và OrderDetail trước</w:t>
+      </w:r>
+    </w:p>
+    <w:p>
+      <w:pPr>
+        <w:pStyle w:val="ListParagraph"/>
+        <w:numPr>
+          <w:ilvl w:val="0"/>
+          <w:numId w:val="1"/>
+        </w:numPr>
+        <w:spacing w:line="240" w:lineRule="auto"/>
+      </w:pPr>
+      <w:r>
+        <w:t>Xem danh sách: phân trang, lọc theo danh mục, tìm kiếm theo tên</w:t>
+      </w:r>
+    </w:p>
+    <w:p>
+      <w:pPr>
+        <w:pStyle w:val="ListParagraph"/>
+        <w:numPr>
+          <w:ilvl w:val="0"/>
+          <w:numId w:val="1"/>
+        </w:numPr>
+        <w:spacing w:line="240" w:lineRule="auto"/>
+      </w:pPr>
+      <w:r>
+        <w:t>Thêm mới : form upload ảnh (IformFile), chọn danh mục từ dropdown</w:t>
+      </w:r>
+    </w:p>
+    <w:p>
+      <w:pPr>
+        <w:pStyle w:val="ListParagraph"/>
+        <w:numPr>
+          <w:ilvl w:val="0"/>
+          <w:numId w:val="1"/>
+        </w:numPr>
+        <w:spacing w:line="240" w:lineRule="auto"/>
+      </w:pPr>
+      <w:r>
+        <w:t>Chỉnh sửa: cập nhật thông tin, thay thế ảnh cũ</w:t>
+      </w:r>
+    </w:p>
+    <w:p>
+      <w:pPr>
+        <w:pStyle w:val="ListParagraph"/>
+        <w:numPr>
+          <w:ilvl w:val="0"/>
+          <w:numId w:val="1"/>
+        </w:numPr>
+        <w:spacing w:line="240" w:lineRule="auto"/>
+      </w:pPr>
+      <w:r>
+        <w:t>Xóa: cascade delete hoàn toàn, cập nhật category.Total</w:t>
+      </w:r>
+    </w:p>
+    <w:p>
+      <w:pPr>
+        <w:spacing w:line="240" w:lineRule="auto"/>
+        <w:ind w:left="2160"/>
+      </w:pPr>
+    </w:p>
+    <w:p>
+      <w:pPr>
+        <w:spacing w:line="240" w:lineRule="auto"/>
+        <w:ind w:left="2160"/>
+      </w:pPr>
+      <w:r>
+        <w:t>4.2.2 Quản lý đơn hàng</w:t>
+      </w:r>
+    </w:p>
+    <w:p>
+      <w:pPr>
+        <w:spacing w:line="240" w:lineRule="auto"/>
+      </w:pPr>
+      <w:r>
+        <w:tab/>
+      </w:r>
+      <w:r>
+        <w:tab/>
+      </w:r>
+      <w:r>
+        <w:tab/>
+      </w:r>
+      <w:r>
+        <w:tab/>
+        <w:t>Admin xem toàn bộ đơn hàng với bộ lọc trạng thái. Có thể cập nhật trạng thái từ dropdown – mỗi lần thay đổi, Notification sẽ tự động gửi thông báo tới khách hàng</w:t>
+      </w:r>
+    </w:p>
+    <w:p>
+      <w:pPr>
+        <w:spacing w:line="240" w:lineRule="auto"/>
+      </w:pPr>
+    </w:p>
+    <w:p>
+      <w:pPr>
+        <w:spacing w:line="240" w:lineRule="auto"/>
+      </w:pPr>
+      <w:r>
+        <w:tab/>
+      </w:r>
+      <w:r>
+        <w:tab/>
+      </w:r>
+      <w:r>
+        <w:tab/>
+        <w:t>4.2.3 Quản lý danh  mục &amp; thương hiệu</w:t>
+      </w:r>
+    </w:p>
+    <w:p>
+      <w:pPr>
+        <w:pStyle w:val="ListParagraph"/>
+        <w:numPr>
+          <w:ilvl w:val="0"/>
+          <w:numId w:val="3"/>
+        </w:numPr>
+        <w:spacing w:line="240" w:lineRule="auto"/>
+      </w:pPr>
+      <w:r>
+        <w:t>Thêm/Sửa/Xóa danh mục: tên , trademark (Thương hiệu)</w:t>
+      </w:r>
+    </w:p>
+    <w:p>
+      <w:pPr>
+        <w:pStyle w:val="ListParagraph"/>
+        <w:numPr>
+          <w:ilvl w:val="0"/>
+          <w:numId w:val="3"/>
+        </w:numPr>
+        <w:spacing w:line="240" w:lineRule="auto"/>
+      </w:pPr>
+      <w:r>
+        <w:t>Theo dõi Total: Số lượng sản phẩm trong mỗi danh mục tự động cập nhật</w:t>
+      </w:r>
+    </w:p>
+    <w:p>
+      <w:pPr>
+        <w:pStyle w:val="ListParagraph"/>
+        <w:numPr>
+          <w:ilvl w:val="0"/>
+          <w:numId w:val="3"/>
+        </w:numPr>
+        <w:spacing w:line="240" w:lineRule="auto"/>
+      </w:pPr>
+      <w:r>
+        <w:t>Sidebar động: danh mục hiển thị trên trang chủ lấy trực tiếp từ DB</w:t>
+      </w:r>
+    </w:p>
+    <w:p>
+      <w:pPr>
+        <w:spacing w:line="240" w:lineRule="auto"/>
+        <w:ind w:left="2160"/>
+      </w:pPr>
+    </w:p>
+    <w:p>
+      <w:pPr>
+        <w:spacing w:line="240" w:lineRule="auto"/>
+        <w:ind w:left="2160"/>
+      </w:pPr>
+      <w:r>
+        <w:t>4.2.4 Quản lý người dùng</w:t>
+      </w:r>
+    </w:p>
+    <w:p>
+      <w:pPr>
+        <w:pStyle w:val="ListParagraph"/>
+        <w:numPr>
+          <w:ilvl w:val="0"/>
+          <w:numId w:val="4"/>
+        </w:numPr>
+        <w:spacing w:line="240" w:lineRule="auto"/>
+      </w:pPr>
+      <w:r>
+        <w:t>Xem danh sách: tất cả các tài khoản với thông tin đăng ký</w:t>
+      </w:r>
+    </w:p>
+    <w:p>
+      <w:pPr>
+        <w:pStyle w:val="ListParagraph"/>
+        <w:numPr>
+          <w:ilvl w:val="0"/>
+          <w:numId w:val="4"/>
+        </w:numPr>
+        <w:spacing w:line="240" w:lineRule="auto"/>
+      </w:pPr>
+      <w:r>
+        <w:t>Xóa tài khoản: cascade delete đúng thứ tự (OrderDetail – Order – CartItem – User)</w:t>
+      </w:r>
+    </w:p>
+    <w:p>
+      <w:pPr>
+        <w:pStyle w:val="ListParagraph"/>
+        <w:numPr>
+          <w:ilvl w:val="0"/>
+          <w:numId w:val="4"/>
+        </w:numPr>
+        <w:spacing w:line="240" w:lineRule="auto"/>
+      </w:pPr>
+      <w:r>
+        <w:t>[Authorize(Roles = “Admin”)]: chặn hoàn toàn truy cập trái phép</w:t>
+      </w:r>
+    </w:p>
+    <w:p>
+      <w:pPr>
+        <w:spacing w:line="240" w:lineRule="auto"/>
+      </w:pPr>
+    </w:p>
+    <w:p>
+      <w:pPr>
+        <w:spacing w:line="240" w:lineRule="auto"/>
+      </w:pPr>
+      <w:r>
+        <w:t>CHƯƠNG 5 : CÔNG NGHỆ &amp; THƯ VIỆN</w:t>
+      </w:r>
+    </w:p>
+    <w:p>
+      <w:pPr>
+        <w:spacing w:line="240" w:lineRule="auto"/>
+      </w:pPr>
+      <w:r>
+        <w:tab/>
+      </w:r>
+      <w:r>
+        <w:tab/>
+        <w:t>5.1 Backend</w:t>
+      </w:r>
+    </w:p>
+    <w:p>
+      <w:pPr>
+        <w:spacing w:line="240" w:lineRule="auto"/>
+      </w:pPr>
+      <w:r>
+        <w:tab/>
+      </w:r>
+      <w:r>
+        <w:tab/>
+      </w:r>
+    </w:p>
+    <w:tbl>
+      <w:tblPr>
+        <w:tblStyle w:val="TableGrid"/>
+        <w:tblW w:w="0" w:type="auto"/>
+        <w:tblLook w:val="04A0" w:firstRow="1" w:lastRow="0" w:firstColumn="1" w:lastColumn="0" w:noHBand="0" w:noVBand="1"/>
+      </w:tblPr>
+      <w:tblGrid>
+        <w:gridCol w:w="3131"/>
+        <w:gridCol w:w="3132"/>
+        <w:gridCol w:w="3132"/>
+      </w:tblGrid>
+      <w:tr>
+        <w:tc>
+          <w:tcPr>
+            <w:tcW w:w="3131" w:type="dxa"/>
+          </w:tcPr>
+          <w:p>
+            <w:pPr>
+              <w:jc w:val="center"/>
+            </w:pPr>
+            <w:r>
+              <w:t>Công nghệ/Thư viện</w:t>
+            </w:r>
+          </w:p>
+        </w:tc>
+        <w:tc>
+          <w:tcPr>
+            <w:tcW w:w="3132" w:type="dxa"/>
+          </w:tcPr>
+          <w:p>
+            <w:pPr>
+              <w:jc w:val="center"/>
+            </w:pPr>
+            <w:r>
+              <w:t>Phiên bản</w:t>
+            </w:r>
+          </w:p>
+        </w:tc>
+        <w:tc>
+          <w:tcPr>
+            <w:tcW w:w="3132" w:type="dxa"/>
+          </w:tcPr>
+          <w:p>
+            <w:pPr>
+              <w:jc w:val="center"/>
+            </w:pPr>
+            <w:r>
+              <w:t>Vai trò</w:t>
+            </w:r>
+          </w:p>
+        </w:tc>
+      </w:tr>
+      <w:tr>
+        <w:tc>
+          <w:tcPr>
+            <w:tcW w:w="3131" w:type="dxa"/>
+          </w:tcPr>
+          <w:p>
+            <w:pPr>
+              <w:jc w:val="center"/>
+            </w:pPr>
+            <w:r>
+              <w:t>ASP.NET Core MVC</w:t>
+            </w:r>
+          </w:p>
+        </w:tc>
+        <w:tc>
+          <w:tcPr>
+            <w:tcW w:w="3132" w:type="dxa"/>
+          </w:tcPr>
+          <w:p>
+            <w:pPr>
+              <w:jc w:val="center"/>
+            </w:pPr>
+            <w:r>
+              <w:t>8.0</w:t>
+            </w:r>
+          </w:p>
+        </w:tc>
+        <w:tc>
+          <w:tcPr>
+            <w:tcW w:w="3132" w:type="dxa"/>
+          </w:tcPr>
+          <w:p>
+            <w:pPr>
+              <w:jc w:val="center"/>
+            </w:pPr>
+            <w:r>
+              <w:t>Framework web chính – Controller , Routing, Middleware</w:t>
+            </w:r>
+          </w:p>
+        </w:tc>
+      </w:tr>
+      <w:tr>
+        <w:tc>
+          <w:tcPr>
+            <w:tcW w:w="3131" w:type="dxa"/>
+          </w:tcPr>
+          <w:p>
+            <w:pPr>
+              <w:jc w:val="center"/>
+            </w:pPr>
+            <w:r>
+              <w:t>C#</w:t>
+            </w:r>
+          </w:p>
+        </w:tc>
+        <w:tc>
+          <w:tcPr>
+            <w:tcW w:w="3132" w:type="dxa"/>
+          </w:tcPr>
+          <w:p>
+            <w:pPr>
+              <w:jc w:val="center"/>
+            </w:pPr>
+            <w:r>
+              <w:t>12</w:t>
+            </w:r>
+          </w:p>
+        </w:tc>
+        <w:tc>
+          <w:tcPr>
+            <w:tcW w:w="3132" w:type="dxa"/>
+          </w:tcPr>
+          <w:p>
+            <w:pPr>
+              <w:jc w:val="center"/>
+            </w:pPr>
+            <w:r>
+              <w:t>Ngỗ ngữ lập trình chính – Async/await , LINQ, Generics</w:t>
+            </w:r>
+          </w:p>
+        </w:tc>
+      </w:tr>
+      <w:tr>
+        <w:tc>
+          <w:tcPr>
+            <w:tcW w:w="3131" w:type="dxa"/>
+          </w:tcPr>
+          <w:p>
+            <w:pPr>
+              <w:jc w:val="center"/>
+            </w:pPr>
+            <w:r>
+              <w:t>Enitty Framework Core</w:t>
+            </w:r>
+          </w:p>
+        </w:tc>
+        <w:tc>
+          <w:tcPr>
+            <w:tcW w:w="3132" w:type="dxa"/>
+          </w:tcPr>
+          <w:p>
+            <w:pPr>
+              <w:jc w:val="center"/>
+            </w:pPr>
+            <w:r>
+              <w:t>8.0</w:t>
+            </w:r>
+          </w:p>
+        </w:tc>
+        <w:tc>
+          <w:tcPr>
+            <w:tcW w:w="3132" w:type="dxa"/>
+          </w:tcPr>
+          <w:p>
+            <w:pPr>
+              <w:jc w:val="center"/>
+            </w:pPr>
+            <w:r>
+              <w:t>Provider kết nối SQL Server cho EF Core</w:t>
+            </w:r>
+          </w:p>
+        </w:tc>
+      </w:tr>
+      <w:tr>
+        <w:tc>
+          <w:tcPr>
+            <w:tcW w:w="3131" w:type="dxa"/>
+          </w:tcPr>
+          <w:p>
+            <w:pPr>
+              <w:jc w:val="center"/>
+            </w:pPr>
+            <w:r>
+              <w:t>Cookie Authentication</w:t>
+            </w:r>
+          </w:p>
+        </w:tc>
+        <w:tc>
+          <w:tcPr>
+            <w:tcW w:w="3132" w:type="dxa"/>
+          </w:tcPr>
+          <w:p>
+            <w:pPr>
+              <w:jc w:val="center"/>
+            </w:pPr>
+            <w:r>
+              <w:t>8.0</w:t>
+            </w:r>
+          </w:p>
+        </w:tc>
+        <w:tc>
+          <w:tcPr>
+            <w:tcW w:w="3132" w:type="dxa"/>
+          </w:tcPr>
+          <w:p>
+            <w:pPr>
+              <w:jc w:val="center"/>
+            </w:pPr>
+            <w:r>
+              <w:t>Xác thực người dùng – Claims, Cookies, Roles</w:t>
+            </w:r>
+          </w:p>
+        </w:tc>
+      </w:tr>
+    </w:tbl>
+    <w:p>
+      <w:pPr>
+        <w:spacing w:line="240" w:lineRule="auto"/>
+      </w:pPr>
+      <w:r>
+        <w:tab/>
+      </w:r>
+    </w:p>
+    <w:p>
+      <w:pPr>
+        <w:spacing w:line="240" w:lineRule="auto"/>
+      </w:pPr>
+    </w:p>
+    <w:p>
+      <w:pPr>
+        <w:spacing w:line="240" w:lineRule="auto"/>
+      </w:pPr>
+    </w:p>
+    <w:p>
+      <w:pPr>
+        <w:spacing w:line="240" w:lineRule="auto"/>
+      </w:pPr>
+    </w:p>
+    <w:p>
+      <w:pPr>
+        <w:spacing w:line="240" w:lineRule="auto"/>
+      </w:pPr>
+      <w:r>
+        <w:lastRenderedPageBreak/>
+        <w:tab/>
+      </w:r>
+      <w:r>
+        <w:tab/>
+        <w:t>5.2 Frontend</w:t>
+      </w:r>
+    </w:p>
+    <w:p>
+      <w:pPr>
+        <w:spacing w:line="240" w:lineRule="auto"/>
+      </w:pPr>
+      <w:r>
+        <w:tab/>
+      </w:r>
+    </w:p>
+    <w:tbl>
+      <w:tblPr>
+        <w:tblStyle w:val="TableGrid"/>
+        <w:tblW w:w="0" w:type="auto"/>
+        <w:tblLook w:val="04A0" w:firstRow="1" w:lastRow="0" w:firstColumn="1" w:lastColumn="0" w:noHBand="0" w:noVBand="1"/>
+      </w:tblPr>
+      <w:tblGrid>
+        <w:gridCol w:w="3131"/>
+        <w:gridCol w:w="3132"/>
+        <w:gridCol w:w="3132"/>
+      </w:tblGrid>
+      <w:tr>
+        <w:tc>
+          <w:tcPr>
+            <w:tcW w:w="3131" w:type="dxa"/>
+          </w:tcPr>
+          <w:p>
+            <w:pPr>
+              <w:jc w:val="center"/>
+            </w:pPr>
+            <w:r>
+              <w:t>Công nghệ</w:t>
+            </w:r>
+          </w:p>
+        </w:tc>
+        <w:tc>
+          <w:tcPr>
+            <w:tcW w:w="3132" w:type="dxa"/>
+          </w:tcPr>
+          <w:p>
+            <w:pPr>
+              <w:jc w:val="center"/>
+            </w:pPr>
+            <w:r>
+              <w:t>Loại</w:t>
+            </w:r>
+          </w:p>
+        </w:tc>
+        <w:tc>
+          <w:tcPr>
+            <w:tcW w:w="3132" w:type="dxa"/>
+          </w:tcPr>
+          <w:p>
+            <w:pPr>
+              <w:jc w:val="center"/>
+            </w:pPr>
+            <w:r>
+              <w:t>Mô tả</w:t>
+            </w:r>
+          </w:p>
+        </w:tc>
+      </w:tr>
+      <w:tr>
+        <w:tc>
+          <w:tcPr>
+            <w:tcW w:w="3131" w:type="dxa"/>
+          </w:tcPr>
+          <w:p>
+            <w:pPr>
+              <w:jc w:val="center"/>
+            </w:pPr>
+            <w:r>
+              <w:t>Razor(.cshtml)</w:t>
+            </w:r>
+          </w:p>
+        </w:tc>
+        <w:tc>
+          <w:tcPr>
+            <w:tcW w:w="3132" w:type="dxa"/>
+          </w:tcPr>
+          <w:p>
+            <w:pPr>
+              <w:jc w:val="center"/>
+            </w:pPr>
+            <w:r>
+              <w:t>Template Engine</w:t>
+            </w:r>
+          </w:p>
+        </w:tc>
+        <w:tc>
+          <w:tcPr>
+            <w:tcW w:w="3132" w:type="dxa"/>
+          </w:tcPr>
+          <w:p>
+            <w:pPr>
+              <w:jc w:val="center"/>
+            </w:pPr>
+            <w:r>
+              <w:t>Render HTML từ server với C# nhúng vào</w:t>
+            </w:r>
+          </w:p>
+        </w:tc>
+      </w:tr>
+      <w:tr>
+        <w:tc>
+          <w:tcPr>
+            <w:tcW w:w="3131" w:type="dxa"/>
+          </w:tcPr>
+          <w:p>
+            <w:pPr>
+              <w:jc w:val="center"/>
+            </w:pPr>
+            <w:r>
+              <w:t>CSS3/ changspa.css</w:t>
+            </w:r>
+          </w:p>
+        </w:tc>
+        <w:tc>
+          <w:tcPr>
+            <w:tcW w:w="3132" w:type="dxa"/>
+          </w:tcPr>
+          <w:p>
+            <w:pPr>
+              <w:jc w:val="center"/>
+            </w:pPr>
+            <w:r>
+              <w:t>Styling</w:t>
+            </w:r>
+          </w:p>
+        </w:tc>
+        <w:tc>
+          <w:tcPr>
+            <w:tcW w:w="3132" w:type="dxa"/>
+          </w:tcPr>
+          <w:p>
+            <w:pPr>
+              <w:jc w:val="center"/>
+            </w:pPr>
+            <w:r>
+              <w:t>Biến css, Flexbox, Grid, Màu hồng thương hiệu</w:t>
+            </w:r>
+          </w:p>
+        </w:tc>
+      </w:tr>
+      <w:tr>
+        <w:tc>
+          <w:tcPr>
+            <w:tcW w:w="3131" w:type="dxa"/>
+          </w:tcPr>
+          <w:p>
+            <w:pPr>
+              <w:jc w:val="center"/>
+            </w:pPr>
+            <w:r>
+              <w:t>JavaScript / Fetch API</w:t>
+            </w:r>
+          </w:p>
+        </w:tc>
+        <w:tc>
+          <w:tcPr>
+            <w:tcW w:w="3132" w:type="dxa"/>
+          </w:tcPr>
+          <w:p>
+            <w:pPr>
+              <w:jc w:val="center"/>
+            </w:pPr>
+            <w:r>
+              <w:t>Scripting</w:t>
+            </w:r>
+          </w:p>
+        </w:tc>
+        <w:tc>
+          <w:tcPr>
+            <w:tcW w:w="3132" w:type="dxa"/>
+          </w:tcPr>
+          <w:p>
+            <w:pPr>
+              <w:jc w:val="center"/>
+            </w:pPr>
+            <w:r>
+              <w:t>AJAX, thêm giỏ hàng không reload, JSON</w:t>
+            </w:r>
+          </w:p>
+        </w:tc>
+      </w:tr>
+      <w:tr>
+        <w:tc>
+          <w:tcPr>
+            <w:tcW w:w="3131" w:type="dxa"/>
+          </w:tcPr>
+          <w:p>
+            <w:pPr>
+              <w:jc w:val="center"/>
+            </w:pPr>
+            <w:r>
+              <w:t>Tag Helpers</w:t>
+            </w:r>
+          </w:p>
+        </w:tc>
+        <w:tc>
+          <w:tcPr>
+            <w:tcW w:w="3132" w:type="dxa"/>
+          </w:tcPr>
+          <w:p>
+            <w:pPr>
+              <w:jc w:val="center"/>
+            </w:pPr>
+            <w:r>
+              <w:t>Razor Helper</w:t>
+            </w:r>
+          </w:p>
+        </w:tc>
+        <w:tc>
+          <w:tcPr>
+            <w:tcW w:w="3132" w:type="dxa"/>
+          </w:tcPr>
+          <w:p>
+            <w:pPr>
+              <w:jc w:val="center"/>
+            </w:pPr>
+            <w:r>
+              <w:t>asp-for, asp-action, asp-route</w:t>
+            </w:r>
+          </w:p>
+          <w:p>
+            <w:pPr>
+              <w:jc w:val="center"/>
+            </w:pPr>
+            <w:r>
+              <w:t>-IntelliSense HTML</w:t>
+            </w:r>
+          </w:p>
+        </w:tc>
+      </w:tr>
+      <w:tr>
+        <w:tc>
+          <w:tcPr>
+            <w:tcW w:w="3131" w:type="dxa"/>
+          </w:tcPr>
+          <w:p>
+            <w:pPr>
+              <w:jc w:val="center"/>
+            </w:pPr>
+            <w:r>
+              <w:t>Google Fonts</w:t>
+            </w:r>
+          </w:p>
+        </w:tc>
+        <w:tc>
+          <w:tcPr>
+            <w:tcW w:w="3132" w:type="dxa"/>
+          </w:tcPr>
+          <w:p>
+            <w:pPr>
+              <w:jc w:val="center"/>
+            </w:pPr>
+            <w:r>
+              <w:t>Typograpy</w:t>
+            </w:r>
+          </w:p>
+        </w:tc>
+        <w:tc>
+          <w:tcPr>
+            <w:tcW w:w="3132" w:type="dxa"/>
+          </w:tcPr>
+          <w:p>
+            <w:pPr>
+              <w:jc w:val="center"/>
+            </w:pPr>
+            <w:r>
+              <w:t>Playfair Display + DM Sans</w:t>
+            </w:r>
+          </w:p>
+        </w:tc>
+      </w:tr>
+      <w:tr>
+        <w:tc>
+          <w:tcPr>
+            <w:tcW w:w="3131" w:type="dxa"/>
+          </w:tcPr>
+          <w:p>
+            <w:pPr>
+              <w:jc w:val="center"/>
+            </w:pPr>
+            <w:r>
+              <w:t>Bootstrap</w:t>
+            </w:r>
+          </w:p>
+        </w:tc>
+        <w:tc>
+          <w:tcPr>
+            <w:tcW w:w="3132" w:type="dxa"/>
+          </w:tcPr>
+          <w:p>
+            <w:pPr>
+              <w:jc w:val="center"/>
+            </w:pPr>
+            <w:r>
+              <w:t>UI Framework</w:t>
+            </w:r>
+          </w:p>
+        </w:tc>
+        <w:tc>
+          <w:tcPr>
+            <w:tcW w:w="3132" w:type="dxa"/>
+          </w:tcPr>
+          <w:p>
+            <w:pPr>
+              <w:jc w:val="center"/>
+            </w:pPr>
+            <w:r>
+              <w:t>Grid system, responsive</w:t>
+            </w:r>
+            <w:r>
+              <w:t>, component cơ bản</w:t>
+            </w:r>
+          </w:p>
+        </w:tc>
+      </w:tr>
+    </w:tbl>
+    <w:p>
+      <w:pPr>
+        <w:spacing w:line="240" w:lineRule="auto"/>
+      </w:pPr>
+    </w:p>
+    <w:p>
+      <w:pPr>
+        <w:spacing w:line="240" w:lineRule="auto"/>
+      </w:pPr>
+      <w:r>
+        <w:tab/>
+      </w:r>
+      <w:r>
+        <w:tab/>
+        <w:t>5.3 Nuget Packages theo tầng</w:t>
+      </w:r>
+    </w:p>
+    <w:p>
+      <w:pPr>
+        <w:spacing w:line="240" w:lineRule="auto"/>
+      </w:pPr>
+      <w:r>
+        <w:tab/>
+      </w:r>
+      <w:r>
+        <w:tab/>
+      </w:r>
+      <w:r>
+        <w:tab/>
+        <w:t># ChangSpaBeauTy.Infrastructure</w:t>
+      </w:r>
+    </w:p>
+    <w:p>
+      <w:pPr>
+        <w:spacing w:line="240" w:lineRule="auto"/>
+      </w:pPr>
+      <w:r>
+        <w:tab/>
+      </w:r>
+      <w:r>
+        <w:tab/>
+      </w:r>
+      <w:r>
+        <w:tab/>
+        <w:t>Dotnet add package:</w:t>
+      </w:r>
+    </w:p>
+    <w:p>
+      <w:pPr>
+        <w:spacing w:line="240" w:lineRule="auto"/>
+      </w:pPr>
+      <w:r>
+        <w:tab/>
+      </w:r>
+      <w:r>
+        <w:tab/>
+      </w:r>
+      <w:r>
+        <w:tab/>
+      </w:r>
+      <w:r>
+        <w:tab/>
+      </w:r>
+      <w:r>
+        <w:t>Microsoft.EntityFrameworkCore.SqlServer</w:t>
+      </w:r>
+    </w:p>
+    <w:p>
+      <w:pPr>
+        <w:spacing w:line="240" w:lineRule="auto"/>
+      </w:pPr>
+      <w:r>
+        <w:tab/>
+      </w:r>
+      <w:r>
+        <w:tab/>
+      </w:r>
+      <w:r>
+        <w:tab/>
+      </w:r>
+      <w:r>
+        <w:tab/>
+      </w:r>
+      <w:r>
+        <w:t>Microsoft.EntityFrameworkCore.Tools</w:t>
+      </w:r>
+    </w:p>
+    <w:p>
+      <w:pPr>
+        <w:spacing w:line="240" w:lineRule="auto"/>
+      </w:pPr>
+      <w:r>
+        <w:tab/>
+      </w:r>
+      <w:r>
+        <w:tab/>
+      </w:r>
+      <w:r>
+        <w:tab/>
+        <w:t># ChangSpaBeauTy.Web</w:t>
+      </w:r>
+    </w:p>
+    <w:p>
+      <w:pPr>
+        <w:spacing w:line="240" w:lineRule="auto"/>
+      </w:pPr>
+      <w:r>
+        <w:tab/>
+      </w:r>
+      <w:r>
+        <w:tab/>
+      </w:r>
+      <w:r>
+        <w:tab/>
+        <w:t>Dotnet add package:</w:t>
+      </w:r>
+    </w:p>
+    <w:p>
+      <w:pPr>
+        <w:spacing w:line="240" w:lineRule="auto"/>
+      </w:pPr>
+      <w:r>
+        <w:tab/>
+      </w:r>
+      <w:r>
+        <w:tab/>
+      </w:r>
+      <w:r>
+        <w:tab/>
+      </w:r>
+      <w:r>
+        <w:tab/>
+      </w:r>
+      <w:r>
+        <w:t>Microsoft.EntityFrameworkCore.Design</w:t>
+      </w:r>
+    </w:p>
+    <w:p>
+      <w:pPr>
+        <w:spacing w:line="240" w:lineRule="auto"/>
+      </w:pPr>
+      <w:r>
+        <w:tab/>
+      </w:r>
+      <w:r>
+        <w:tab/>
+      </w:r>
+      <w:r>
+        <w:tab/>
+      </w:r>
+      <w:r>
+        <w:tab/>
+      </w:r>
+      <w:r>
+        <w:t>Microsoft.AspNetCore.Authentication.Cookies</w:t>
+      </w:r>
+    </w:p>
+    <w:p>
+      <w:pPr>
+        <w:spacing w:line="240" w:lineRule="auto"/>
       </w:pPr>
     </w:p>
     <w:sectPr>
-      <w:footerReference w:type="default" r:id="rId27"/>
+      <w:footerReference w:type="default" r:id="rId36"/>
       <w:pgSz w:w="12240" w:h="15840" w:code="1"/>
       <w:pgMar w:top="1134" w:right="1134" w:bottom="1134" w:left="1701" w:header="720" w:footer="720" w:gutter="0"/>
       <w:pgBorders w:display="firstPage">
@@ -5788,7 +7702,7 @@
         <w:rFonts w:ascii="Aptos" w:eastAsiaTheme="minorEastAsia" w:hAnsi="Aptos" w:cstheme="minorBidi" w:hint="default"/>
       </w:rPr>
     </w:lvl>
-    <w:lvl w:ilvl="1" w:tplc="04090003" w:tentative="1">
+    <w:lvl w:ilvl="1" w:tplc="04090003">
       <w:start w:val="1"/>
       <w:numFmt w:val="bullet"/>
       <w:lvlText w:val="o"/>
@@ -5885,8 +7799,356 @@
       </w:rPr>
     </w:lvl>
   </w:abstractNum>
+  <w:abstractNum w:abstractNumId="1" w15:restartNumberingAfterBreak="0">
+    <w:nsid w:val="3B8D52A2"/>
+    <w:multiLevelType w:val="hybridMultilevel"/>
+    <w:tmpl w:val="A6908898"/>
+    <w:lvl w:ilvl="0" w:tplc="D90C61DE">
+      <w:start w:val="1"/>
+      <w:numFmt w:val="bullet"/>
+      <w:lvlText w:val="-"/>
+      <w:lvlJc w:val="left"/>
+      <w:pPr>
+        <w:ind w:left="2880" w:hanging="360"/>
+      </w:pPr>
+      <w:rPr>
+        <w:rFonts w:ascii="Aptos" w:eastAsiaTheme="minorEastAsia" w:hAnsi="Aptos" w:cstheme="minorBidi" w:hint="default"/>
+      </w:rPr>
+    </w:lvl>
+    <w:lvl w:ilvl="1" w:tplc="04090003" w:tentative="1">
+      <w:start w:val="1"/>
+      <w:numFmt w:val="bullet"/>
+      <w:lvlText w:val="o"/>
+      <w:lvlJc w:val="left"/>
+      <w:pPr>
+        <w:ind w:left="3600" w:hanging="360"/>
+      </w:pPr>
+      <w:rPr>
+        <w:rFonts w:ascii="Courier New" w:hAnsi="Courier New" w:cs="Courier New" w:hint="default"/>
+      </w:rPr>
+    </w:lvl>
+    <w:lvl w:ilvl="2" w:tplc="04090005" w:tentative="1">
+      <w:start w:val="1"/>
+      <w:numFmt w:val="bullet"/>
+      <w:lvlText w:val=""/>
+      <w:lvlJc w:val="left"/>
+      <w:pPr>
+        <w:ind w:left="4320" w:hanging="360"/>
+      </w:pPr>
+      <w:rPr>
+        <w:rFonts w:ascii="Wingdings" w:hAnsi="Wingdings" w:hint="default"/>
+      </w:rPr>
+    </w:lvl>
+    <w:lvl w:ilvl="3" w:tplc="04090001" w:tentative="1">
+      <w:start w:val="1"/>
+      <w:numFmt w:val="bullet"/>
+      <w:lvlText w:val=""/>
+      <w:lvlJc w:val="left"/>
+      <w:pPr>
+        <w:ind w:left="5040" w:hanging="360"/>
+      </w:pPr>
+      <w:rPr>
+        <w:rFonts w:ascii="Symbol" w:hAnsi="Symbol" w:hint="default"/>
+      </w:rPr>
+    </w:lvl>
+    <w:lvl w:ilvl="4" w:tplc="04090003" w:tentative="1">
+      <w:start w:val="1"/>
+      <w:numFmt w:val="bullet"/>
+      <w:lvlText w:val="o"/>
+      <w:lvlJc w:val="left"/>
+      <w:pPr>
+        <w:ind w:left="5760" w:hanging="360"/>
+      </w:pPr>
+      <w:rPr>
+        <w:rFonts w:ascii="Courier New" w:hAnsi="Courier New" w:cs="Courier New" w:hint="default"/>
+      </w:rPr>
+    </w:lvl>
+    <w:lvl w:ilvl="5" w:tplc="04090005" w:tentative="1">
+      <w:start w:val="1"/>
+      <w:numFmt w:val="bullet"/>
+      <w:lvlText w:val=""/>
+      <w:lvlJc w:val="left"/>
+      <w:pPr>
+        <w:ind w:left="6480" w:hanging="360"/>
+      </w:pPr>
+      <w:rPr>
+        <w:rFonts w:ascii="Wingdings" w:hAnsi="Wingdings" w:hint="default"/>
+      </w:rPr>
+    </w:lvl>
+    <w:lvl w:ilvl="6" w:tplc="04090001" w:tentative="1">
+      <w:start w:val="1"/>
+      <w:numFmt w:val="bullet"/>
+      <w:lvlText w:val=""/>
+      <w:lvlJc w:val="left"/>
+      <w:pPr>
+        <w:ind w:left="7200" w:hanging="360"/>
+      </w:pPr>
+      <w:rPr>
+        <w:rFonts w:ascii="Symbol" w:hAnsi="Symbol" w:hint="default"/>
+      </w:rPr>
+    </w:lvl>
+    <w:lvl w:ilvl="7" w:tplc="04090003" w:tentative="1">
+      <w:start w:val="1"/>
+      <w:numFmt w:val="bullet"/>
+      <w:lvlText w:val="o"/>
+      <w:lvlJc w:val="left"/>
+      <w:pPr>
+        <w:ind w:left="7920" w:hanging="360"/>
+      </w:pPr>
+      <w:rPr>
+        <w:rFonts w:ascii="Courier New" w:hAnsi="Courier New" w:cs="Courier New" w:hint="default"/>
+      </w:rPr>
+    </w:lvl>
+    <w:lvl w:ilvl="8" w:tplc="04090005" w:tentative="1">
+      <w:start w:val="1"/>
+      <w:numFmt w:val="bullet"/>
+      <w:lvlText w:val=""/>
+      <w:lvlJc w:val="left"/>
+      <w:pPr>
+        <w:ind w:left="8640" w:hanging="360"/>
+      </w:pPr>
+      <w:rPr>
+        <w:rFonts w:ascii="Wingdings" w:hAnsi="Wingdings" w:hint="default"/>
+      </w:rPr>
+    </w:lvl>
+  </w:abstractNum>
+  <w:abstractNum w:abstractNumId="2" w15:restartNumberingAfterBreak="0">
+    <w:nsid w:val="4FF95BF1"/>
+    <w:multiLevelType w:val="hybridMultilevel"/>
+    <w:tmpl w:val="EE6EADB8"/>
+    <w:lvl w:ilvl="0" w:tplc="D90C61DE">
+      <w:start w:val="1"/>
+      <w:numFmt w:val="bullet"/>
+      <w:lvlText w:val="-"/>
+      <w:lvlJc w:val="left"/>
+      <w:pPr>
+        <w:ind w:left="3600" w:hanging="360"/>
+      </w:pPr>
+      <w:rPr>
+        <w:rFonts w:ascii="Aptos" w:eastAsiaTheme="minorEastAsia" w:hAnsi="Aptos" w:cstheme="minorBidi" w:hint="default"/>
+      </w:rPr>
+    </w:lvl>
+    <w:lvl w:ilvl="1" w:tplc="04090003" w:tentative="1">
+      <w:start w:val="1"/>
+      <w:numFmt w:val="bullet"/>
+      <w:lvlText w:val="o"/>
+      <w:lvlJc w:val="left"/>
+      <w:pPr>
+        <w:ind w:left="4320" w:hanging="360"/>
+      </w:pPr>
+      <w:rPr>
+        <w:rFonts w:ascii="Courier New" w:hAnsi="Courier New" w:cs="Courier New" w:hint="default"/>
+      </w:rPr>
+    </w:lvl>
+    <w:lvl w:ilvl="2" w:tplc="04090005" w:tentative="1">
+      <w:start w:val="1"/>
+      <w:numFmt w:val="bullet"/>
+      <w:lvlText w:val=""/>
+      <w:lvlJc w:val="left"/>
+      <w:pPr>
+        <w:ind w:left="5040" w:hanging="360"/>
+      </w:pPr>
+      <w:rPr>
+        <w:rFonts w:ascii="Wingdings" w:hAnsi="Wingdings" w:hint="default"/>
+      </w:rPr>
+    </w:lvl>
+    <w:lvl w:ilvl="3" w:tplc="04090001" w:tentative="1">
+      <w:start w:val="1"/>
+      <w:numFmt w:val="bullet"/>
+      <w:lvlText w:val=""/>
+      <w:lvlJc w:val="left"/>
+      <w:pPr>
+        <w:ind w:left="5760" w:hanging="360"/>
+      </w:pPr>
+      <w:rPr>
+        <w:rFonts w:ascii="Symbol" w:hAnsi="Symbol" w:hint="default"/>
+      </w:rPr>
+    </w:lvl>
+    <w:lvl w:ilvl="4" w:tplc="04090003" w:tentative="1">
+      <w:start w:val="1"/>
+      <w:numFmt w:val="bullet"/>
+      <w:lvlText w:val="o"/>
+      <w:lvlJc w:val="left"/>
+      <w:pPr>
+        <w:ind w:left="6480" w:hanging="360"/>
+      </w:pPr>
+      <w:rPr>
+        <w:rFonts w:ascii="Courier New" w:hAnsi="Courier New" w:cs="Courier New" w:hint="default"/>
+      </w:rPr>
+    </w:lvl>
+    <w:lvl w:ilvl="5" w:tplc="04090005" w:tentative="1">
+      <w:start w:val="1"/>
+      <w:numFmt w:val="bullet"/>
+      <w:lvlText w:val=""/>
+      <w:lvlJc w:val="left"/>
+      <w:pPr>
+        <w:ind w:left="7200" w:hanging="360"/>
+      </w:pPr>
+      <w:rPr>
+        <w:rFonts w:ascii="Wingdings" w:hAnsi="Wingdings" w:hint="default"/>
+      </w:rPr>
+    </w:lvl>
+    <w:lvl w:ilvl="6" w:tplc="04090001" w:tentative="1">
+      <w:start w:val="1"/>
+      <w:numFmt w:val="bullet"/>
+      <w:lvlText w:val=""/>
+      <w:lvlJc w:val="left"/>
+      <w:pPr>
+        <w:ind w:left="7920" w:hanging="360"/>
+      </w:pPr>
+      <w:rPr>
+        <w:rFonts w:ascii="Symbol" w:hAnsi="Symbol" w:hint="default"/>
+      </w:rPr>
+    </w:lvl>
+    <w:lvl w:ilvl="7" w:tplc="04090003" w:tentative="1">
+      <w:start w:val="1"/>
+      <w:numFmt w:val="bullet"/>
+      <w:lvlText w:val="o"/>
+      <w:lvlJc w:val="left"/>
+      <w:pPr>
+        <w:ind w:left="8640" w:hanging="360"/>
+      </w:pPr>
+      <w:rPr>
+        <w:rFonts w:ascii="Courier New" w:hAnsi="Courier New" w:cs="Courier New" w:hint="default"/>
+      </w:rPr>
+    </w:lvl>
+    <w:lvl w:ilvl="8" w:tplc="04090005" w:tentative="1">
+      <w:start w:val="1"/>
+      <w:numFmt w:val="bullet"/>
+      <w:lvlText w:val=""/>
+      <w:lvlJc w:val="left"/>
+      <w:pPr>
+        <w:ind w:left="9360" w:hanging="360"/>
+      </w:pPr>
+      <w:rPr>
+        <w:rFonts w:ascii="Wingdings" w:hAnsi="Wingdings" w:hint="default"/>
+      </w:rPr>
+    </w:lvl>
+  </w:abstractNum>
+  <w:abstractNum w:abstractNumId="3" w15:restartNumberingAfterBreak="0">
+    <w:nsid w:val="7D8518A1"/>
+    <w:multiLevelType w:val="hybridMultilevel"/>
+    <w:tmpl w:val="163E8C48"/>
+    <w:lvl w:ilvl="0" w:tplc="D90C61DE">
+      <w:start w:val="1"/>
+      <w:numFmt w:val="bullet"/>
+      <w:lvlText w:val="-"/>
+      <w:lvlJc w:val="left"/>
+      <w:pPr>
+        <w:ind w:left="2880" w:hanging="360"/>
+      </w:pPr>
+      <w:rPr>
+        <w:rFonts w:ascii="Aptos" w:eastAsiaTheme="minorEastAsia" w:hAnsi="Aptos" w:cstheme="minorBidi" w:hint="default"/>
+      </w:rPr>
+    </w:lvl>
+    <w:lvl w:ilvl="1" w:tplc="04090003" w:tentative="1">
+      <w:start w:val="1"/>
+      <w:numFmt w:val="bullet"/>
+      <w:lvlText w:val="o"/>
+      <w:lvlJc w:val="left"/>
+      <w:pPr>
+        <w:ind w:left="3600" w:hanging="360"/>
+      </w:pPr>
+      <w:rPr>
+        <w:rFonts w:ascii="Courier New" w:hAnsi="Courier New" w:cs="Courier New" w:hint="default"/>
+      </w:rPr>
+    </w:lvl>
+    <w:lvl w:ilvl="2" w:tplc="04090005" w:tentative="1">
+      <w:start w:val="1"/>
+      <w:numFmt w:val="bullet"/>
+      <w:lvlText w:val=""/>
+      <w:lvlJc w:val="left"/>
+      <w:pPr>
+        <w:ind w:left="4320" w:hanging="360"/>
+      </w:pPr>
+      <w:rPr>
+        <w:rFonts w:ascii="Wingdings" w:hAnsi="Wingdings" w:hint="default"/>
+      </w:rPr>
+    </w:lvl>
+    <w:lvl w:ilvl="3" w:tplc="04090001" w:tentative="1">
+      <w:start w:val="1"/>
+      <w:numFmt w:val="bullet"/>
+      <w:lvlText w:val=""/>
+      <w:lvlJc w:val="left"/>
+      <w:pPr>
+        <w:ind w:left="5040" w:hanging="360"/>
+      </w:pPr>
+      <w:rPr>
+        <w:rFonts w:ascii="Symbol" w:hAnsi="Symbol" w:hint="default"/>
+      </w:rPr>
+    </w:lvl>
+    <w:lvl w:ilvl="4" w:tplc="04090003" w:tentative="1">
+      <w:start w:val="1"/>
+      <w:numFmt w:val="bullet"/>
+      <w:lvlText w:val="o"/>
+      <w:lvlJc w:val="left"/>
+      <w:pPr>
+        <w:ind w:left="5760" w:hanging="360"/>
+      </w:pPr>
+      <w:rPr>
+        <w:rFonts w:ascii="Courier New" w:hAnsi="Courier New" w:cs="Courier New" w:hint="default"/>
+      </w:rPr>
+    </w:lvl>
+    <w:lvl w:ilvl="5" w:tplc="04090005" w:tentative="1">
+      <w:start w:val="1"/>
+      <w:numFmt w:val="bullet"/>
+      <w:lvlText w:val=""/>
+      <w:lvlJc w:val="left"/>
+      <w:pPr>
+        <w:ind w:left="6480" w:hanging="360"/>
+      </w:pPr>
+      <w:rPr>
+        <w:rFonts w:ascii="Wingdings" w:hAnsi="Wingdings" w:hint="default"/>
+      </w:rPr>
+    </w:lvl>
+    <w:lvl w:ilvl="6" w:tplc="04090001" w:tentative="1">
+      <w:start w:val="1"/>
+      <w:numFmt w:val="bullet"/>
+      <w:lvlText w:val=""/>
+      <w:lvlJc w:val="left"/>
+      <w:pPr>
+        <w:ind w:left="7200" w:hanging="360"/>
+      </w:pPr>
+      <w:rPr>
+        <w:rFonts w:ascii="Symbol" w:hAnsi="Symbol" w:hint="default"/>
+      </w:rPr>
+    </w:lvl>
+    <w:lvl w:ilvl="7" w:tplc="04090003" w:tentative="1">
+      <w:start w:val="1"/>
+      <w:numFmt w:val="bullet"/>
+      <w:lvlText w:val="o"/>
+      <w:lvlJc w:val="left"/>
+      <w:pPr>
+        <w:ind w:left="7920" w:hanging="360"/>
+      </w:pPr>
+      <w:rPr>
+        <w:rFonts w:ascii="Courier New" w:hAnsi="Courier New" w:cs="Courier New" w:hint="default"/>
+      </w:rPr>
+    </w:lvl>
+    <w:lvl w:ilvl="8" w:tplc="04090005" w:tentative="1">
+      <w:start w:val="1"/>
+      <w:numFmt w:val="bullet"/>
+      <w:lvlText w:val=""/>
+      <w:lvlJc w:val="left"/>
+      <w:pPr>
+        <w:ind w:left="8640" w:hanging="360"/>
+      </w:pPr>
+      <w:rPr>
+        <w:rFonts w:ascii="Wingdings" w:hAnsi="Wingdings" w:hint="default"/>
+      </w:rPr>
+    </w:lvl>
+  </w:abstractNum>
   <w:num w:numId="1" w16cid:durableId="808980396">
     <w:abstractNumId w:val="0"/>
+  </w:num>
+  <w:num w:numId="2" w16cid:durableId="266894469">
+    <w:abstractNumId w:val="2"/>
+  </w:num>
+  <w:num w:numId="3" w16cid:durableId="79985857">
+    <w:abstractNumId w:val="1"/>
+  </w:num>
+  <w:num w:numId="4" w16cid:durableId="1690257869">
+    <w:abstractNumId w:val="3"/>
   </w:num>
 </w:numbering>
 </file>
@@ -6500,7 +8762,6 @@
   <w:style w:type="character" w:default="1" w:styleId="DefaultParagraphFont">
     <w:name w:val="Default Paragraph Font"/>
     <w:uiPriority w:val="1"/>
-    <w:semiHidden/>
     <w:unhideWhenUsed/>
   </w:style>
   <w:style w:type="table" w:default="1" w:styleId="TableNormal">

</xml_diff>